<commit_message>
Add candidate name and date to PadCare submission document
Co-Authored-By: Claude Opus 5.5 <noreply@anthropic.com>
Claude-Session: https://claude.ai/code/session_01P9ewpUXrB5sSqw25BBShWy
</commit_message>
<xml_diff>
--- a/padcare-assessment/09_final/PadCare_Complaint_Management_Assessment.docx
+++ b/padcare-assessment/09_final/PadCare_Complaint_Management_Assessment.docx
@@ -52,10 +52,8 @@
           <w:bCs/>
           <w:sz w:val="24"/>
           <w:szCs w:val="24"/>
-          <w:highlight w:val="yellow"/>
-          <w:highlightCs w:val="yellow"/>
         </w:rPr>
-        <w:t xml:space="preserve">[Candidate Name]</w:t>
+        <w:t xml:space="preserve">Dipanshu Tyagi</w:t>
       </w:r>
     </w:p>
     <w:p>
@@ -67,10 +65,8 @@
           <w:color w:val="5F6B76"/>
           <w:sz w:val="22"/>
           <w:szCs w:val="22"/>
-          <w:highlight w:val="yellow"/>
-          <w:highlightCs w:val="yellow"/>
         </w:rPr>
-        <w:t xml:space="preserve">[Date]</w:t>
+        <w:t xml:space="preserve">26 October 2026</w:t>
       </w:r>
     </w:p>
     <w:p>

</xml_diff>